<commit_message>
feat: export tables to PDF and Word and keep them on Word import
</commit_message>
<xml_diff>
--- a/src/importers/docx/__fixtures__/libreoffice.docx
+++ b/src/importers/docx/__fixtures__/libreoffice.docx
@@ -425,6 +425,18 @@
       <w:r>
         <w:rPr/>
         <w:t>Photo</w:t>
+      </w:r>
+    </w:p>
+    <w:p>
+      <w:pPr>
+        <w:pStyle w:val="Normal"/>
+        <w:bidi w:val="0"/>
+        <w:jc w:val="left"/>
+        <w:rPr/>
+      </w:pPr>
+      <w:r>
+        <w:rPr/>
+        <w:t>Values</w:t>
       </w:r>
     </w:p>
     <w:tbl>
@@ -576,6 +588,158 @@
         </w:tc>
       </w:tr>
     </w:tbl>
+    <w:tbl>
+      <w:tblPr>
+        <w:tblW w:w="1650" w:type="pct"/>
+        <w:jc w:val="center"/>
+        <w:tblInd w:w="0" w:type="dxa"/>
+        <w:tblLayout w:type="fixed"/>
+        <w:tblCellMar>
+          <w:top w:w="0" w:type="dxa"/>
+          <w:left w:w="0" w:type="dxa"/>
+          <w:bottom w:w="0" w:type="dxa"/>
+          <w:right w:w="0" w:type="dxa"/>
+        </w:tblCellMar>
+      </w:tblPr>
+      <w:tblGrid>
+        <w:gridCol w:w="1029"/>
+        <w:gridCol w:w="1029"/>
+        <w:gridCol w:w="1030"/>
+      </w:tblGrid>
+      <w:tr>
+        <w:trPr>
+          <w:tblHeader w:val="true"/>
+        </w:trPr>
+        <w:tc>
+          <w:tcPr>
+            <w:tcW w:w="3088" w:type="dxa"/>
+            <w:gridSpan w:val="3"/>
+            <w:tcBorders/>
+          </w:tcPr>
+          <w:p>
+            <w:pPr>
+              <w:pStyle w:val="TableHeading"/>
+              <w:suppressLineNumbers/>
+              <w:bidi w:val="0"/>
+              <w:ind w:hanging="0" w:left="43" w:right="43"/>
+              <w:jc w:val="left"/>
+              <w:rPr/>
+            </w:pPr>
+            <w:r>
+              <w:rPr/>
+              <w:t>Q1</w:t>
+            </w:r>
+          </w:p>
+        </w:tc>
+      </w:tr>
+      <w:tr>
+        <w:trPr/>
+        <w:tc>
+          <w:tcPr>
+            <w:tcW w:w="1029" w:type="dxa"/>
+            <w:tcBorders/>
+          </w:tcPr>
+          <w:p>
+            <w:pPr>
+              <w:pStyle w:val="TableContents"/>
+              <w:suppressLineNumbers/>
+              <w:bidi w:val="0"/>
+              <w:ind w:hanging="0" w:left="43" w:right="43"/>
+              <w:jc w:val="left"/>
+              <w:rPr/>
+            </w:pPr>
+            <w:r>
+              <w:rPr/>
+              <w:t>Jan</w:t>
+            </w:r>
+          </w:p>
+        </w:tc>
+        <w:tc>
+          <w:tcPr>
+            <w:tcW w:w="1029" w:type="dxa"/>
+            <w:tcBorders/>
+          </w:tcPr>
+          <w:p>
+            <w:pPr>
+              <w:pStyle w:val="TableContents"/>
+              <w:suppressLineNumbers/>
+              <w:bidi w:val="0"/>
+              <w:ind w:hanging="0" w:left="43" w:right="43"/>
+              <w:jc w:val="left"/>
+              <w:rPr/>
+            </w:pPr>
+            <w:r>
+              <w:rPr/>
+              <w:t>Feb</w:t>
+            </w:r>
+          </w:p>
+        </w:tc>
+        <w:tc>
+          <w:tcPr>
+            <w:tcW w:w="1030" w:type="dxa"/>
+            <w:tcBorders/>
+          </w:tcPr>
+          <w:p>
+            <w:pPr>
+              <w:pStyle w:val="TableContents"/>
+              <w:suppressLineNumbers/>
+              <w:bidi w:val="0"/>
+              <w:ind w:hanging="0" w:left="43" w:right="43"/>
+              <w:jc w:val="left"/>
+              <w:rPr/>
+            </w:pPr>
+            <w:r>
+              <w:rPr/>
+              <w:t>Mar</w:t>
+            </w:r>
+          </w:p>
+        </w:tc>
+      </w:tr>
+      <w:tr>
+        <w:trPr/>
+        <w:tc>
+          <w:tcPr>
+            <w:tcW w:w="2058" w:type="dxa"/>
+            <w:gridSpan w:val="2"/>
+            <w:tcBorders/>
+          </w:tcPr>
+          <w:p>
+            <w:pPr>
+              <w:pStyle w:val="TableContents"/>
+              <w:suppressLineNumbers/>
+              <w:bidi w:val="0"/>
+              <w:ind w:hanging="0" w:left="43" w:right="43"/>
+              <w:jc w:val="left"/>
+              <w:rPr/>
+            </w:pPr>
+            <w:r>
+              <w:rPr/>
+              <w:t>North</w:t>
+            </w:r>
+          </w:p>
+        </w:tc>
+        <w:tc>
+          <w:tcPr>
+            <w:tcW w:w="1030" w:type="dxa"/>
+            <w:tcBorders/>
+          </w:tcPr>
+          <w:p>
+            <w:pPr>
+              <w:pStyle w:val="TableContents"/>
+              <w:suppressLineNumbers/>
+              <w:bidi w:val="0"/>
+              <w:ind w:hanging="0" w:left="43" w:right="43"/>
+              <w:jc w:val="left"/>
+              <w:rPr/>
+            </w:pPr>
+            <w:r>
+              <w:rPr/>
+              <w:t>30</w:t>
+            </w:r>
+          </w:p>
+        </w:tc>
+      </w:tr>
+    </w:tbl>
     <w:p>
       <w:pPr>
         <w:pStyle w:val="Firstparagraph"/>

</xml_diff>

<commit_message>
feat: export tables to PDF and Word and keep them on Word import (#60)
* feat: export tables to PDF and Word and keep them on Word import

* fix: captions go to the table below them and table styles share one source
</commit_message>
<xml_diff>
--- a/src/importers/docx/__fixtures__/libreoffice.docx
+++ b/src/importers/docx/__fixtures__/libreoffice.docx
@@ -425,6 +425,18 @@
       <w:r>
         <w:rPr/>
         <w:t>Photo</w:t>
+      </w:r>
+    </w:p>
+    <w:p>
+      <w:pPr>
+        <w:pStyle w:val="Normal"/>
+        <w:bidi w:val="0"/>
+        <w:jc w:val="left"/>
+        <w:rPr/>
+      </w:pPr>
+      <w:r>
+        <w:rPr/>
+        <w:t>Values</w:t>
       </w:r>
     </w:p>
     <w:tbl>
@@ -576,6 +588,158 @@
         </w:tc>
       </w:tr>
     </w:tbl>
+    <w:tbl>
+      <w:tblPr>
+        <w:tblW w:w="1650" w:type="pct"/>
+        <w:jc w:val="center"/>
+        <w:tblInd w:w="0" w:type="dxa"/>
+        <w:tblLayout w:type="fixed"/>
+        <w:tblCellMar>
+          <w:top w:w="0" w:type="dxa"/>
+          <w:left w:w="0" w:type="dxa"/>
+          <w:bottom w:w="0" w:type="dxa"/>
+          <w:right w:w="0" w:type="dxa"/>
+        </w:tblCellMar>
+      </w:tblPr>
+      <w:tblGrid>
+        <w:gridCol w:w="1029"/>
+        <w:gridCol w:w="1029"/>
+        <w:gridCol w:w="1030"/>
+      </w:tblGrid>
+      <w:tr>
+        <w:trPr>
+          <w:tblHeader w:val="true"/>
+        </w:trPr>
+        <w:tc>
+          <w:tcPr>
+            <w:tcW w:w="3088" w:type="dxa"/>
+            <w:gridSpan w:val="3"/>
+            <w:tcBorders/>
+          </w:tcPr>
+          <w:p>
+            <w:pPr>
+              <w:pStyle w:val="TableHeading"/>
+              <w:suppressLineNumbers/>
+              <w:bidi w:val="0"/>
+              <w:ind w:hanging="0" w:left="43" w:right="43"/>
+              <w:jc w:val="left"/>
+              <w:rPr/>
+            </w:pPr>
+            <w:r>
+              <w:rPr/>
+              <w:t>Q1</w:t>
+            </w:r>
+          </w:p>
+        </w:tc>
+      </w:tr>
+      <w:tr>
+        <w:trPr/>
+        <w:tc>
+          <w:tcPr>
+            <w:tcW w:w="1029" w:type="dxa"/>
+            <w:tcBorders/>
+          </w:tcPr>
+          <w:p>
+            <w:pPr>
+              <w:pStyle w:val="TableContents"/>
+              <w:suppressLineNumbers/>
+              <w:bidi w:val="0"/>
+              <w:ind w:hanging="0" w:left="43" w:right="43"/>
+              <w:jc w:val="left"/>
+              <w:rPr/>
+            </w:pPr>
+            <w:r>
+              <w:rPr/>
+              <w:t>Jan</w:t>
+            </w:r>
+          </w:p>
+        </w:tc>
+        <w:tc>
+          <w:tcPr>
+            <w:tcW w:w="1029" w:type="dxa"/>
+            <w:tcBorders/>
+          </w:tcPr>
+          <w:p>
+            <w:pPr>
+              <w:pStyle w:val="TableContents"/>
+              <w:suppressLineNumbers/>
+              <w:bidi w:val="0"/>
+              <w:ind w:hanging="0" w:left="43" w:right="43"/>
+              <w:jc w:val="left"/>
+              <w:rPr/>
+            </w:pPr>
+            <w:r>
+              <w:rPr/>
+              <w:t>Feb</w:t>
+            </w:r>
+          </w:p>
+        </w:tc>
+        <w:tc>
+          <w:tcPr>
+            <w:tcW w:w="1030" w:type="dxa"/>
+            <w:tcBorders/>
+          </w:tcPr>
+          <w:p>
+            <w:pPr>
+              <w:pStyle w:val="TableContents"/>
+              <w:suppressLineNumbers/>
+              <w:bidi w:val="0"/>
+              <w:ind w:hanging="0" w:left="43" w:right="43"/>
+              <w:jc w:val="left"/>
+              <w:rPr/>
+            </w:pPr>
+            <w:r>
+              <w:rPr/>
+              <w:t>Mar</w:t>
+            </w:r>
+          </w:p>
+        </w:tc>
+      </w:tr>
+      <w:tr>
+        <w:trPr/>
+        <w:tc>
+          <w:tcPr>
+            <w:tcW w:w="2058" w:type="dxa"/>
+            <w:gridSpan w:val="2"/>
+            <w:tcBorders/>
+          </w:tcPr>
+          <w:p>
+            <w:pPr>
+              <w:pStyle w:val="TableContents"/>
+              <w:suppressLineNumbers/>
+              <w:bidi w:val="0"/>
+              <w:ind w:hanging="0" w:left="43" w:right="43"/>
+              <w:jc w:val="left"/>
+              <w:rPr/>
+            </w:pPr>
+            <w:r>
+              <w:rPr/>
+              <w:t>North</w:t>
+            </w:r>
+          </w:p>
+        </w:tc>
+        <w:tc>
+          <w:tcPr>
+            <w:tcW w:w="1030" w:type="dxa"/>
+            <w:tcBorders/>
+          </w:tcPr>
+          <w:p>
+            <w:pPr>
+              <w:pStyle w:val="TableContents"/>
+              <w:suppressLineNumbers/>
+              <w:bidi w:val="0"/>
+              <w:ind w:hanging="0" w:left="43" w:right="43"/>
+              <w:jc w:val="left"/>
+              <w:rPr/>
+            </w:pPr>
+            <w:r>
+              <w:rPr/>
+              <w:t>30</w:t>
+            </w:r>
+          </w:p>
+        </w:tc>
+      </w:tr>
+    </w:tbl>
     <w:p>
       <w:pPr>
         <w:pStyle w:val="Firstparagraph"/>

</xml_diff>